<commit_message>
Complete Milestone 2 AI project intelligence platform
</commit_message>
<xml_diff>
--- a/data/raw/meeting_notes.docx
+++ b/data/raw/meeting_notes.docx
@@ -4,51 +4,222 @@
   <w:body>
     <w:p>
       <w:r>
-        <w:t>Meeting Date: September 1, 2026</w:t>
-      </w:r>
-    </w:p>
-    <w:p/>
-    <w:p>
-      <w:r>
-        <w:t>Project: Smart Campus Assistant</w:t>
-      </w:r>
-    </w:p>
-    <w:p/>
-    <w:p>
-      <w:r>
-        <w:t>Current Status:</w:t>
-      </w:r>
-    </w:p>
-    <w:p>
-      <w:r>
-        <w:t>Frontend development is 90% complete.</w:t>
-      </w:r>
-    </w:p>
-    <w:p>
-      <w:r>
-        <w:t>Backend development is 60% complete.</w:t>
-      </w:r>
-    </w:p>
-    <w:p/>
-    <w:p>
-      <w:r>
-        <w:t>Blocker:</w:t>
-      </w:r>
-    </w:p>
-    <w:p>
-      <w:r>
-        <w:t>Authentication implementation is incomplete.</w:t>
-      </w:r>
-    </w:p>
-    <w:p/>
-    <w:p>
-      <w:r>
-        <w:t>Action Item:</w:t>
-      </w:r>
-    </w:p>
-    <w:p>
-      <w:r>
-        <w:t>Backend team must complete authentication.</w:t>
+        <w:t>PROJECT MEETING NOTES</w:t>
+      </w:r>
+    </w:p>
+    <w:p/>
+    <w:p>
+      <w:r>
+        <w:t>Project: E-Commerce Platform Modernization</w:t>
+      </w:r>
+    </w:p>
+    <w:p/>
+    <w:p>
+      <w:r>
+        <w:t>Meeting Date: September 15, 2026</w:t>
+      </w:r>
+    </w:p>
+    <w:p/>
+    <w:p>
+      <w:r>
+        <w:t>Meeting Type: Weekly Project Status Meeting</w:t>
+      </w:r>
+    </w:p>
+    <w:p/>
+    <w:p>
+      <w:r>
+        <w:t>Project Status</w:t>
+      </w:r>
+    </w:p>
+    <w:p/>
+    <w:p>
+      <w:r>
+        <w:t xml:space="preserve">The project is currently progressing through the architecture and initial development activities. The cloud architecture design has been completed. Product </w:t>
+      </w:r>
+      <w:proofErr w:type="spellStart"/>
+      <w:r>
+        <w:t>catalog</w:t>
+      </w:r>
+      <w:proofErr w:type="spellEnd"/>
+      <w:r>
+        <w:t xml:space="preserve"> migration has started, and the authentication module is currently under development.</w:t>
+      </w:r>
+    </w:p>
+    <w:p/>
+    <w:p>
+      <w:r>
+        <w:t>Completed Activities</w:t>
+      </w:r>
+    </w:p>
+    <w:p/>
+    <w:p>
+      <w:r>
+        <w:t>• Cloud architecture design completed by Ananya.</w:t>
+      </w:r>
+    </w:p>
+    <w:p>
+      <w:r>
+        <w:t xml:space="preserve">• Initial product </w:t>
+      </w:r>
+      <w:proofErr w:type="spellStart"/>
+      <w:r>
+        <w:t>catalog</w:t>
+      </w:r>
+      <w:proofErr w:type="spellEnd"/>
+      <w:r>
+        <w:t xml:space="preserve"> migration started.</w:t>
+      </w:r>
+    </w:p>
+    <w:p>
+      <w:r>
+        <w:t>• CI/CD pipeline design has been discussed.</w:t>
+      </w:r>
+    </w:p>
+    <w:p>
+      <w:r>
+        <w:t>• Integration testing plan has been prepared by the QA team.</w:t>
+      </w:r>
+    </w:p>
+    <w:p/>
+    <w:p>
+      <w:r>
+        <w:t>Current Issues</w:t>
+      </w:r>
+    </w:p>
+    <w:p/>
+    <w:p>
+      <w:r>
+        <w:t>The payment gateway integration is currently blocked because the required payment provider credentials have not yet been received.</w:t>
+      </w:r>
+    </w:p>
+    <w:p/>
+    <w:p>
+      <w:r>
+        <w:t>The authentication module is still under development and must be completed before system integration testing can begin.</w:t>
+      </w:r>
+    </w:p>
+    <w:p/>
+    <w:p>
+      <w:r>
+        <w:lastRenderedPageBreak/>
+        <w:t>The cloud environment requires final infrastructure approval before production deployment.</w:t>
+      </w:r>
+    </w:p>
+    <w:p/>
+    <w:p>
+      <w:r>
+        <w:t>Key Dependencies</w:t>
+      </w:r>
+    </w:p>
+    <w:p/>
+    <w:p>
+      <w:r>
+        <w:t>• Payment gateway integration depends on receiving payment provider credentials.</w:t>
+      </w:r>
+    </w:p>
+    <w:p>
+      <w:r>
+        <w:t xml:space="preserve">• System integration testing depends on completion of the product </w:t>
+      </w:r>
+      <w:proofErr w:type="spellStart"/>
+      <w:r>
+        <w:t>catalog</w:t>
+      </w:r>
+      <w:proofErr w:type="spellEnd"/>
+      <w:r>
+        <w:t xml:space="preserve"> and authentication modules.</w:t>
+      </w:r>
+    </w:p>
+    <w:p>
+      <w:r>
+        <w:t>• Production deployment depends on successful integration testing and cloud environment approval.</w:t>
+      </w:r>
+    </w:p>
+    <w:p/>
+    <w:p>
+      <w:r>
+        <w:t>Decisions Made</w:t>
+      </w:r>
+    </w:p>
+    <w:p/>
+    <w:p>
+      <w:r>
+        <w:t>1. System integration testing will remain scheduled for October 21, 2026.</w:t>
+      </w:r>
+    </w:p>
+    <w:p>
+      <w:r>
+        <w:t>2. Payment gateway integration will begin immediately after the required provider credentials are received.</w:t>
+      </w:r>
+    </w:p>
+    <w:p>
+      <w:r>
+        <w:t>3. The QA team will prepare test cases in parallel while development activities continue.</w:t>
+      </w:r>
+    </w:p>
+    <w:p/>
+    <w:p>
+      <w:r>
+        <w:t>Action Items</w:t>
+      </w:r>
+    </w:p>
+    <w:p/>
+    <w:p>
+      <w:r>
+        <w:t>1. Arjun will follow up on the payment provider credentials by September 18, 2026.</w:t>
+      </w:r>
+    </w:p>
+    <w:p>
+      <w:r>
+        <w:t>2. Meera will complete the authentication module by October 15, 2026.</w:t>
+      </w:r>
+    </w:p>
+    <w:p>
+      <w:r>
+        <w:t xml:space="preserve">3. Rahul will continue product </w:t>
+      </w:r>
+      <w:proofErr w:type="spellStart"/>
+      <w:r>
+        <w:t>catalog</w:t>
+      </w:r>
+      <w:proofErr w:type="spellEnd"/>
+      <w:r>
+        <w:t xml:space="preserve"> migration and target completion by October 5, 2026.</w:t>
+      </w:r>
+    </w:p>
+    <w:p>
+      <w:r>
+        <w:t>4. Ananya will coordinate the final cloud infrastructure approval.</w:t>
+      </w:r>
+    </w:p>
+    <w:p>
+      <w:r>
+        <w:t>5. Karthik will continue CI/CD pipeline implementation with a target completion date of October 25, 2026.</w:t>
+      </w:r>
+    </w:p>
+    <w:p>
+      <w:r>
+        <w:t>6. The QA team will finalize integration test cases before October 21, 2026.</w:t>
+      </w:r>
+    </w:p>
+    <w:p/>
+    <w:p>
+      <w:r>
+        <w:t>Next Review</w:t>
+      </w:r>
+    </w:p>
+    <w:p/>
+    <w:p>
+      <w:r>
+        <w:t xml:space="preserve">The next project status review will evaluate payment gateway credentials, authentication progress, product </w:t>
+      </w:r>
+      <w:proofErr w:type="spellStart"/>
+      <w:r>
+        <w:t>catalog</w:t>
+      </w:r>
+      <w:proofErr w:type="spellEnd"/>
+      <w:r>
+        <w:t xml:space="preserve"> migration, and cloud infrastructure approval.</w:t>
       </w:r>
     </w:p>
     <w:sectPr>

</xml_diff>